<commit_message>
ADDING TODAY'S WORK - 04.06.2026
</commit_message>
<xml_diff>
--- a/write_up/drafts/5_discussion/discussion_plan.docx
+++ b/write_up/drafts/5_discussion/discussion_plan.docx
@@ -2,7 +2,26 @@
 <file path=word/document.xml><?xml version="1.0" encoding="utf-8"?>
 <w:document xmlns:wpc="http://schemas.microsoft.com/office/word/2010/wordprocessingCanvas" xmlns:cx="http://schemas.microsoft.com/office/drawing/2014/chartex" xmlns:cx1="http://schemas.microsoft.com/office/drawing/2015/9/8/chartex" xmlns:cx2="http://schemas.microsoft.com/office/drawing/2015/10/21/chartex" xmlns:cx3="http://schemas.microsoft.com/office/drawing/2016/5/9/chartex" xmlns:cx4="http://schemas.microsoft.com/office/drawing/2016/5/10/chartex" xmlns:cx5="http://schemas.microsoft.com/office/drawing/2016/5/11/chartex" xmlns:cx6="http://schemas.microsoft.com/office/drawing/2016/5/12/chartex" xmlns:cx7="http://schemas.microsoft.com/office/drawing/2016/5/13/chartex" xmlns:cx8="http://schemas.microsoft.com/office/drawing/2016/5/14/chartex" xmlns:mc="http://schemas.openxmlformats.org/markup-compatibility/2006" xmlns:aink="http://schemas.microsoft.com/office/drawing/2016/ink" xmlns:am3d="http://schemas.microsoft.com/office/drawing/2017/model3d" xmlns:o="urn:schemas-microsoft-com:office:office" xmlns:oel="http://schemas.microsoft.com/office/2019/extlst" xmlns:r="http://schemas.openxmlformats.org/officeDocument/2006/relationships" xmlns:m="http://schemas.openxmlformats.org/officeDocument/2006/math" xmlns:v="urn:schemas-microsoft-com:vml" xmlns:wp14="http://schemas.microsoft.com/office/word/2010/wordprocessingDrawing" xmlns:wp="http://schemas.openxmlformats.org/drawingml/2006/wordprocessingDrawing" xmlns:w10="urn:schemas-microsoft-com:office:word" xmlns:w="http://schemas.openxmlformats.org/wordprocessingml/2006/main" xmlns:w14="http://schemas.microsoft.com/office/word/2010/wordml" xmlns:w15="http://schemas.microsoft.com/office/word/2012/wordml" xmlns:w16cex="http://schemas.microsoft.com/office/word/2018/wordml/cex" xmlns:w16cid="http://schemas.microsoft.com/office/word/2016/wordml/cid" xmlns:w16="http://schemas.microsoft.com/office/word/2018/wordml" xmlns:w16du="http://schemas.microsoft.com/office/word/2023/wordml/word16du" xmlns:w16sdtdh="http://schemas.microsoft.com/office/word/2020/wordml/sdtdatahash" xmlns:w16sdtfl="http://schemas.microsoft.com/office/word/2024/wordml/sdtformatlock" xmlns:w16se="http://schemas.microsoft.com/office/word/2015/wordml/symex" xmlns:wpg="http://schemas.microsoft.com/office/word/2010/wordprocessingGroup" xmlns:wpi="http://schemas.microsoft.com/office/word/2010/wordprocessingInk" xmlns:wne="http://schemas.microsoft.com/office/word/2006/wordml" xmlns:wps="http://schemas.microsoft.com/office/word/2010/wordprocessingShape" mc:Ignorable="w14 w15 w16se w16cid w16 w16cex w16sdtdh w16sdtfl w16du wp14">
   <w:body>
-    <w:p/>
+    <w:p>
+      <w:pPr>
+        <w:pStyle w:val="ListParagraph"/>
+        <w:numPr>
+          <w:ilvl w:val="0"/>
+          <w:numId w:val="2"/>
+        </w:numPr>
+      </w:pPr>
+      <w:r>
+        <w:t>Need to mention that exosomes (</w:t>
+      </w:r>
+      <w:proofErr w:type="spellStart"/>
+      <w:r>
+        <w:t>mirna</w:t>
+      </w:r>
+      <w:proofErr w:type="spellEnd"/>
+      <w:r>
+        <w:t xml:space="preserve"> cargo) could be targeting many different types of cells, not just airway-specific cells</w:t>
+      </w:r>
+    </w:p>
     <w:sectPr>
       <w:pgSz w:w="11906" w:h="16838"/>
       <w:pgMar w:top="1440" w:right="1440" w:bottom="1440" w:left="1440" w:header="708" w:footer="708" w:gutter="0"/>
@@ -16,6 +35,119 @@
 <file path=word/numbering.xml><?xml version="1.0" encoding="utf-8"?>
 <w:numbering xmlns:wpc="http://schemas.microsoft.com/office/word/2010/wordprocessingCanvas" xmlns:cx="http://schemas.microsoft.com/office/drawing/2014/chartex" xmlns:cx1="http://schemas.microsoft.com/office/drawing/2015/9/8/chartex" xmlns:cx2="http://schemas.microsoft.com/office/drawing/2015/10/21/chartex" xmlns:cx3="http://schemas.microsoft.com/office/drawing/2016/5/9/chartex" xmlns:cx4="http://schemas.microsoft.com/office/drawing/2016/5/10/chartex" xmlns:cx5="http://schemas.microsoft.com/office/drawing/2016/5/11/chartex" xmlns:cx6="http://schemas.microsoft.com/office/drawing/2016/5/12/chartex" xmlns:cx7="http://schemas.microsoft.com/office/drawing/2016/5/13/chartex" xmlns:cx8="http://schemas.microsoft.com/office/drawing/2016/5/14/chartex" xmlns:mc="http://schemas.openxmlformats.org/markup-compatibility/2006" xmlns:aink="http://schemas.microsoft.com/office/drawing/2016/ink" xmlns:am3d="http://schemas.microsoft.com/office/drawing/2017/model3d" xmlns:o="urn:schemas-microsoft-com:office:office" xmlns:oel="http://schemas.microsoft.com/office/2019/extlst" xmlns:r="http://schemas.openxmlformats.org/officeDocument/2006/relationships" xmlns:m="http://schemas.openxmlformats.org/officeDocument/2006/math" xmlns:v="urn:schemas-microsoft-com:vml" xmlns:wp14="http://schemas.microsoft.com/office/word/2010/wordprocessingDrawing" xmlns:wp="http://schemas.openxmlformats.org/drawingml/2006/wordprocessingDrawing" xmlns:w10="urn:schemas-microsoft-com:office:word" xmlns:w="http://schemas.openxmlformats.org/wordprocessingml/2006/main" xmlns:w14="http://schemas.microsoft.com/office/word/2010/wordml" xmlns:w15="http://schemas.microsoft.com/office/word/2012/wordml" xmlns:w16cex="http://schemas.microsoft.com/office/word/2018/wordml/cex" xmlns:w16cid="http://schemas.microsoft.com/office/word/2016/wordml/cid" xmlns:w16="http://schemas.microsoft.com/office/word/2018/wordml" xmlns:w16du="http://schemas.microsoft.com/office/word/2023/wordml/word16du" xmlns:w16sdtdh="http://schemas.microsoft.com/office/word/2020/wordml/sdtdatahash" xmlns:w16sdtfl="http://schemas.microsoft.com/office/word/2024/wordml/sdtformatlock" xmlns:w16se="http://schemas.microsoft.com/office/word/2015/wordml/symex" xmlns:wpg="http://schemas.microsoft.com/office/word/2010/wordprocessingGroup" xmlns:wpi="http://schemas.microsoft.com/office/word/2010/wordprocessingInk" xmlns:wne="http://schemas.microsoft.com/office/word/2006/wordml" xmlns:wps="http://schemas.microsoft.com/office/word/2010/wordprocessingShape" mc:Ignorable="w14 w15 w16se w16cid w16 w16cex w16sdtdh w16sdtfl w16du wp14">
   <w:abstractNum w:abstractNumId="0" w15:restartNumberingAfterBreak="0">
+    <w:nsid w:val="3AE46B04"/>
+    <w:multiLevelType w:val="hybridMultilevel"/>
+    <w:tmpl w:val="A5505D5A"/>
+    <w:lvl w:ilvl="0" w:tplc="08090001">
+      <w:start w:val="1"/>
+      <w:numFmt w:val="bullet"/>
+      <w:lvlText w:val=""/>
+      <w:lvlJc w:val="left"/>
+      <w:pPr>
+        <w:ind w:left="720" w:hanging="360"/>
+      </w:pPr>
+      <w:rPr>
+        <w:rFonts w:ascii="Symbol" w:hAnsi="Symbol" w:hint="default"/>
+      </w:rPr>
+    </w:lvl>
+    <w:lvl w:ilvl="1" w:tplc="08090003" w:tentative="1">
+      <w:start w:val="1"/>
+      <w:numFmt w:val="bullet"/>
+      <w:lvlText w:val="o"/>
+      <w:lvlJc w:val="left"/>
+      <w:pPr>
+        <w:ind w:left="1440" w:hanging="360"/>
+      </w:pPr>
+      <w:rPr>
+        <w:rFonts w:ascii="Courier New" w:hAnsi="Courier New" w:cs="Courier New" w:hint="default"/>
+      </w:rPr>
+    </w:lvl>
+    <w:lvl w:ilvl="2" w:tplc="08090005" w:tentative="1">
+      <w:start w:val="1"/>
+      <w:numFmt w:val="bullet"/>
+      <w:lvlText w:val=""/>
+      <w:lvlJc w:val="left"/>
+      <w:pPr>
+        <w:ind w:left="2160" w:hanging="360"/>
+      </w:pPr>
+      <w:rPr>
+        <w:rFonts w:ascii="Wingdings" w:hAnsi="Wingdings" w:hint="default"/>
+      </w:rPr>
+    </w:lvl>
+    <w:lvl w:ilvl="3" w:tplc="08090001" w:tentative="1">
+      <w:start w:val="1"/>
+      <w:numFmt w:val="bullet"/>
+      <w:lvlText w:val=""/>
+      <w:lvlJc w:val="left"/>
+      <w:pPr>
+        <w:ind w:left="2880" w:hanging="360"/>
+      </w:pPr>
+      <w:rPr>
+        <w:rFonts w:ascii="Symbol" w:hAnsi="Symbol" w:hint="default"/>
+      </w:rPr>
+    </w:lvl>
+    <w:lvl w:ilvl="4" w:tplc="08090003" w:tentative="1">
+      <w:start w:val="1"/>
+      <w:numFmt w:val="bullet"/>
+      <w:lvlText w:val="o"/>
+      <w:lvlJc w:val="left"/>
+      <w:pPr>
+        <w:ind w:left="3600" w:hanging="360"/>
+      </w:pPr>
+      <w:rPr>
+        <w:rFonts w:ascii="Courier New" w:hAnsi="Courier New" w:cs="Courier New" w:hint="default"/>
+      </w:rPr>
+    </w:lvl>
+    <w:lvl w:ilvl="5" w:tplc="08090005" w:tentative="1">
+      <w:start w:val="1"/>
+      <w:numFmt w:val="bullet"/>
+      <w:lvlText w:val=""/>
+      <w:lvlJc w:val="left"/>
+      <w:pPr>
+        <w:ind w:left="4320" w:hanging="360"/>
+      </w:pPr>
+      <w:rPr>
+        <w:rFonts w:ascii="Wingdings" w:hAnsi="Wingdings" w:hint="default"/>
+      </w:rPr>
+    </w:lvl>
+    <w:lvl w:ilvl="6" w:tplc="08090001" w:tentative="1">
+      <w:start w:val="1"/>
+      <w:numFmt w:val="bullet"/>
+      <w:lvlText w:val=""/>
+      <w:lvlJc w:val="left"/>
+      <w:pPr>
+        <w:ind w:left="5040" w:hanging="360"/>
+      </w:pPr>
+      <w:rPr>
+        <w:rFonts w:ascii="Symbol" w:hAnsi="Symbol" w:hint="default"/>
+      </w:rPr>
+    </w:lvl>
+    <w:lvl w:ilvl="7" w:tplc="08090003" w:tentative="1">
+      <w:start w:val="1"/>
+      <w:numFmt w:val="bullet"/>
+      <w:lvlText w:val="o"/>
+      <w:lvlJc w:val="left"/>
+      <w:pPr>
+        <w:ind w:left="5760" w:hanging="360"/>
+      </w:pPr>
+      <w:rPr>
+        <w:rFonts w:ascii="Courier New" w:hAnsi="Courier New" w:cs="Courier New" w:hint="default"/>
+      </w:rPr>
+    </w:lvl>
+    <w:lvl w:ilvl="8" w:tplc="08090005" w:tentative="1">
+      <w:start w:val="1"/>
+      <w:numFmt w:val="bullet"/>
+      <w:lvlText w:val=""/>
+      <w:lvlJc w:val="left"/>
+      <w:pPr>
+        <w:ind w:left="6480" w:hanging="360"/>
+      </w:pPr>
+      <w:rPr>
+        <w:rFonts w:ascii="Wingdings" w:hAnsi="Wingdings" w:hint="default"/>
+      </w:rPr>
+    </w:lvl>
+  </w:abstractNum>
+  <w:abstractNum w:abstractNumId="1" w15:restartNumberingAfterBreak="0">
     <w:nsid w:val="746A5C0A"/>
     <w:multiLevelType w:val="hybridMultilevel"/>
     <w:tmpl w:val="50DEA51A"/>
@@ -129,6 +261,9 @@
     </w:lvl>
   </w:abstractNum>
   <w:num w:numId="1" w16cid:durableId="853226515">
+    <w:abstractNumId w:val="1"/>
+  </w:num>
+  <w:num w:numId="2" w16cid:durableId="2016414341">
     <w:abstractNumId w:val="0"/>
   </w:num>
 </w:numbering>

</xml_diff>

<commit_message>
ADDING TODAY'S WORK - 22.06.2026
</commit_message>
<xml_diff>
--- a/write_up/drafts/5_discussion/discussion_plan.docx
+++ b/write_up/drafts/5_discussion/discussion_plan.docx
@@ -11,15 +11,7 @@
         </w:numPr>
       </w:pPr>
       <w:r>
-        <w:t>Need to mention that exosomes (</w:t>
-      </w:r>
-      <w:proofErr w:type="spellStart"/>
-      <w:r>
-        <w:t>mirna</w:t>
-      </w:r>
-      <w:proofErr w:type="spellEnd"/>
-      <w:r>
-        <w:t xml:space="preserve"> cargo) could be targeting many different types of cells, not just airway-specific cells</w:t>
+        <w:t>Need to mention that exosomes (mirna cargo) could be targeting many different types of cells, not just airway-specific cells</w:t>
       </w:r>
     </w:p>
     <w:p>
@@ -72,24 +64,10 @@
         </w:numPr>
       </w:pPr>
       <w:r>
-        <w:t xml:space="preserve">Kegg vs </w:t>
-      </w:r>
-      <w:proofErr w:type="spellStart"/>
-      <w:r>
-        <w:t>reactome</w:t>
-      </w:r>
-      <w:proofErr w:type="spellEnd"/>
-      <w:r>
-        <w:t xml:space="preserve"> </w:t>
-      </w:r>
-      <w:r>
-        <w:t>(</w:t>
-      </w:r>
-      <w:r>
-        <w:t>pathway</w:t>
-      </w:r>
-      <w:r>
-        <w:t xml:space="preserve">) </w:t>
+        <w:t xml:space="preserve">Kegg vs reactome </w:t>
+      </w:r>
+      <w:r>
+        <w:t xml:space="preserve">(pathway) </w:t>
       </w:r>
       <w:r>
         <w:t>vs GO</w:t>
@@ -148,12 +126,10 @@
       <w:r>
         <w:t xml:space="preserve">Can’t use (g)sea from raw target genes but could apply a quantitative ranking system then you could use </w:t>
       </w:r>
-      <w:proofErr w:type="spellStart"/>
       <w:proofErr w:type="gramStart"/>
       <w:r>
         <w:t>eit</w:t>
       </w:r>
-      <w:proofErr w:type="spellEnd"/>
       <w:proofErr w:type="gramEnd"/>
       <w:r>
         <w:t xml:space="preserve"> but the system must be robust [probably references for this] </w:t>
@@ -176,15 +152,7 @@
       </w:r>
       <w:proofErr w:type="gramEnd"/>
       <w:r>
-        <w:t xml:space="preserve"> de </w:t>
-      </w:r>
-      <w:proofErr w:type="spellStart"/>
-      <w:r>
-        <w:t>mirnas</w:t>
-      </w:r>
-      <w:proofErr w:type="spellEnd"/>
-      <w:r>
-        <w:t xml:space="preserve"> [can find out number – use for loop in: </w:t>
+        <w:t xml:space="preserve"> de mirnas [can find out number – use for loop in: </w:t>
       </w:r>
       <w:r>
         <w:t>"~/GIT/L4137_HBEC_EV_Transcriptomics-Project/01_Protease/src/scripts/analysis_pipeline/archive 10.35.41/08_FE_indirect_obsolete_19_06_</w:t>
@@ -206,6 +174,137 @@
           <w:numId w:val="2"/>
         </w:numPr>
       </w:pPr>
+      <w:r>
+        <w:t xml:space="preserve">Tamirna raw counts: some identical, some double (due to precursors), some different </w:t>
+      </w:r>
+    </w:p>
+    <w:p>
+      <w:pPr>
+        <w:pStyle w:val="ListParagraph"/>
+        <w:numPr>
+          <w:ilvl w:val="1"/>
+          <w:numId w:val="2"/>
+        </w:numPr>
+      </w:pPr>
+      <w:r>
+        <w:t>T</w:t>
+      </w:r>
+      <w:r>
+        <w:t>hey use the same miRbase database version</w:t>
+      </w:r>
+      <w:r>
+        <w:t xml:space="preserve"> so that’s not the reason</w:t>
+      </w:r>
+      <w:r>
+        <w:t xml:space="preserve"> </w:t>
+      </w:r>
+      <w:r>
+        <w:t xml:space="preserve">for different results </w:t>
+      </w:r>
+      <w:r>
+        <w:t>– 22.1</w:t>
+      </w:r>
+      <w:r>
+        <w:t>.</w:t>
+      </w:r>
+    </w:p>
+    <w:p>
+      <w:pPr>
+        <w:pStyle w:val="ListParagraph"/>
+        <w:numPr>
+          <w:ilvl w:val="1"/>
+          <w:numId w:val="2"/>
+        </w:numPr>
+      </w:pPr>
+      <w:r>
+        <w:t xml:space="preserve">The genome version is </w:t>
+      </w:r>
+      <w:r>
+        <w:t>genomeVersion: p13</w:t>
+      </w:r>
+      <w:r>
+        <w:t xml:space="preserve"> on the mind github, but th</w:t>
+      </w:r>
+      <w:r>
+        <w:t>is doesn’t matter because I don’t use the human genome – they only use it for the read classification bit</w:t>
+      </w:r>
+      <w:r>
+        <w:t xml:space="preserve"> </w:t>
+      </w:r>
+    </w:p>
+    <w:p>
+      <w:pPr>
+        <w:pStyle w:val="ListParagraph"/>
+        <w:numPr>
+          <w:ilvl w:val="0"/>
+          <w:numId w:val="2"/>
+        </w:numPr>
+      </w:pPr>
+      <w:r>
+        <w:t>My edger de pipeline follows the standard</w:t>
+      </w:r>
+      <w:r>
+        <w:t xml:space="preserve">, suggested pipeline by edger whereas tamirna have none-standard steps e.g., </w:t>
+      </w:r>
+    </w:p>
+    <w:p>
+      <w:pPr>
+        <w:pStyle w:val="ListParagraph"/>
+        <w:numPr>
+          <w:ilvl w:val="1"/>
+          <w:numId w:val="2"/>
+        </w:numPr>
+      </w:pPr>
+      <w:proofErr w:type="gramStart"/>
+      <w:r>
+        <w:t>estimateCommonDisp(</w:t>
+      </w:r>
+      <w:proofErr w:type="gramEnd"/>
+      <w:r>
+        <w:t>)</w:t>
+      </w:r>
+    </w:p>
+    <w:p>
+      <w:pPr>
+        <w:pStyle w:val="ListParagraph"/>
+        <w:numPr>
+          <w:ilvl w:val="1"/>
+          <w:numId w:val="2"/>
+        </w:numPr>
+      </w:pPr>
+      <w:proofErr w:type="gramStart"/>
+      <w:r>
+        <w:t>estimateTagwiseDisp(</w:t>
+      </w:r>
+      <w:proofErr w:type="gramEnd"/>
+      <w:r>
+        <w:t>)</w:t>
+      </w:r>
+    </w:p>
+    <w:p>
+      <w:pPr>
+        <w:pStyle w:val="ListParagraph"/>
+        <w:numPr>
+          <w:ilvl w:val="1"/>
+          <w:numId w:val="2"/>
+        </w:numPr>
+      </w:pPr>
+      <w:proofErr w:type="gramStart"/>
+      <w:r>
+        <w:t>filtered.results</w:t>
+      </w:r>
+      <w:proofErr w:type="gramEnd"/>
+      <w:r>
+        <w:t xml:space="preserve">$FDR &lt;- </w:t>
+      </w:r>
+      <w:proofErr w:type="gramStart"/>
+      <w:r>
+        <w:t>filtPadj[</w:t>
+      </w:r>
+      <w:proofErr w:type="gramEnd"/>
+      <w:r>
+        <w:t>, j]</w:t>
+      </w:r>
     </w:p>
     <w:p>
       <w:pPr>

</xml_diff>